<commit_message>
Update CartoVec project frontend and docs
</commit_message>
<xml_diff>
--- a/PFA_Cadrage_Oussama_Chouaibi.docx
+++ b/PFA_Cadrage_Oussama_Chouaibi.docx
@@ -124,7 +124,7 @@
           <w:sz w:val="24"/>
           <w:szCs w:val="24"/>
         </w:rPr>
-        <w:t xml:space="preserve">Étudiant : Mohamed GHARBI</w:t>
+        <w:t xml:space="preserve">Étudiant : Oussama CHOUAIBI</w:t>
       </w:r>
     </w:p>
     <w:p>
@@ -4183,7 +4183,7 @@
         <w:sz w:val="18"/>
         <w:szCs w:val="18"/>
       </w:rPr>
-      <w:t xml:space="preserve">	Mohamed GHARBI — Géomatique 2A</w:t>
+      <w:t xml:space="preserve">	Oussama CHOUAIBI — Géomatique 2A</w:t>
     </w:r>
   </w:p>
 </w:hdr>

</xml_diff>

<commit_message>
Update frontend documentation and dataset configuration for AMS Tunisia
</commit_message>
<xml_diff>
--- a/PFA_Cadrage_Oussama_Chouaibi.docx
+++ b/PFA_Cadrage_Oussama_Chouaibi.docx
@@ -4001,10 +4001,327 @@
     <w:p>
       <w:pPr>
         <w:pStyle w:val="Heading1"/>
+      </w:pPr>
+      <w:r>
+        <w:t xml:space="preserve">9. Etat des integrations</w:t>
+      </w:r>
+    </w:p>
+    <w:p>
+      <w:pPr>
+        <w:spacing w:after="80"/>
+        <w:jc w:val="center"/>
+      </w:pPr>
+      <w:r>
+        <w:rPr>
+          <w:b/>
+          <w:bCs/>
+          <w:sz w:val="24"/>
+          <w:szCs w:val="24"/>
+        </w:rPr>
+        <w:t xml:space="preserve">Ce projet combine trois competences : geomatique (comprehension des cartes et des donnees spatiales), vision par ordinateur classique (OpenCV, scikit-image, calibration HSV sur 8 cartes reelles Tunisie + Algerie) et deep learning applique (PyTorch, U-Net, dataset SEMAP 13 561 echantillons). L'architecture modulaire — pipeline en couches independantes, agent LangGraph orchestrant les etapes, API REST exposant les donnees, frontend React pour la visualisation et la correction interactive avec active learning — permet d'iterer rapidement sur chaque composant sans casser les autres.</w:t>
+      </w:r>
+    </w:p>
+    <w:p>
+      <w:pPr>
+        <w:pStyle w:val="Heading2"/>
         <w:spacing w:after="120" w:before="240"/>
       </w:pPr>
       <w:r>
-        <w:t xml:space="preserve">9. Conclusion</w:t>
+        <w:t xml:space="preserve">9.1 Pipeline cartographique</w:t>
+      </w:r>
+    </w:p>
+    <w:p>
+      <w:pPr>
+        <w:pStyle w:val="ListParagraph"/>
+        <w:numPr>
+          <w:ilvl w:val="0"/>
+          <w:numId w:val="2"/>
+        </w:numPr>
+        <w:spacing w:after="80" w:line="280"/>
+      </w:pPr>
+      <w:r>
+        <w:t xml:space="preserve">Detection en 2 etapes du cadre cartographique. detect_map_frame() identifie le neatline (marge externe), puis detect_legend_x() supprime la legende interne (panneau droit). Calibre sur 8 cartes militaires reelles AMS / GSGS au 1:50 000 — Bizerte, Tunis, Ain El Kseiba (Tunisie), Ain Bessem, Alger, Terny, Warnier, Renault (Algerie).</w:t>
+      </w:r>
+    </w:p>
+    <w:p>
+      <w:pPr>
+        <w:pStyle w:val="ListParagraph"/>
+        <w:numPr>
+          <w:ilvl w:val="0"/>
+          <w:numId w:val="2"/>
+        </w:numPr>
+        <w:spacing w:after="80" w:line="280"/>
+      </w:pPr>
+      <w:r>
+        <w:t xml:space="preserve">Plages HSV calibrees dans data/dataset_config.json. La saturation minimale des routes rouges est abaissee de 90 a 60 pour capturer les routes bordeaux delavees, et celle de la vegetation de 40 a 20.</w:t>
+      </w:r>
+    </w:p>
+    <w:p>
+      <w:pPr>
+        <w:pStyle w:val="ListParagraph"/>
+        <w:numPr>
+          <w:ilvl w:val="0"/>
+          <w:numId w:val="2"/>
+        </w:numPr>
+        <w:spacing w:after="80" w:line="280"/>
+      </w:pPr>
+      <w:r>
+        <w:t xml:space="preserve">Anti-explosion de features. La fonction filter_skeleton_by_length() elimine les composantes squelettisees de longueur inferieure a 50 pixels, ramenant typiquement de 7 000+ fragments parasites a moins de 100 vraies courbes.</w:t>
+      </w:r>
+    </w:p>
+    <w:p>
+      <w:pPr>
+        <w:pStyle w:val="ListParagraph"/>
+        <w:numPr>
+          <w:ilvl w:val="0"/>
+          <w:numId w:val="2"/>
+        </w:numPr>
+        <w:spacing w:after="80" w:line="280"/>
+      </w:pPr>
+      <w:r>
+        <w:t xml:space="preserve">Geo-referencement automatique. 8 feuilles AMS Algerie + Tunisie sont enregistrees dans AMS_ALGERIA_SHEETS avec leurs 4 coins WGS84. Les fonctions apply_transform_to_geojson() et filter_features_by_bbox() convertissent les coords pixel en lat / lon par interpolation bilineaire et filtrent les features qui depassent du cadre.</w:t>
+      </w:r>
+    </w:p>
+    <w:p>
+      <w:pPr>
+        <w:pStyle w:val="Heading2"/>
+        <w:spacing w:after="120" w:before="240"/>
+      </w:pPr>
+      <w:r>
+        <w:t xml:space="preserve">9.2 Agent IA et active learning</w:t>
+      </w:r>
+    </w:p>
+    <w:p>
+      <w:pPr>
+        <w:pStyle w:val="ListParagraph"/>
+        <w:numPr>
+          <w:ilvl w:val="0"/>
+          <w:numId w:val="2"/>
+        </w:numPr>
+        <w:spacing w:after="80" w:line="280"/>
+      </w:pPr>
+      <w:r>
+        <w:t xml:space="preserve">L'orchestrateur pipeline.agent.run_agent() implemente le cycle Perceive -&gt; Plan -&gt; Execute -&gt; QA en LangGraph. Un fallback automatique vers le pipeline classique est declenche si LangGraph n'est pas installe, ce qui garantit que la chaine de traitement fonctionne meme sans dependances optionnelles.</w:t>
+      </w:r>
+    </w:p>
+    <w:p>
+      <w:pPr>
+        <w:pStyle w:val="ListParagraph"/>
+        <w:numPr>
+          <w:ilvl w:val="0"/>
+          <w:numId w:val="2"/>
+        </w:numPr>
+        <w:spacing w:after="80" w:line="280"/>
+      </w:pPr>
+      <w:r>
+        <w:t xml:space="preserve">Active learning de niveau 1. pipeline.active_learning.process_correction() mine les corrections HITL pour mettre a jour les plages HSV par serie de carte. La mise a jour utilise une moyenne mobile exponentielle (EMA alpha = 0.3) pour eviter qu'une correction aberrante ne devie tout le registre.</w:t>
+      </w:r>
+    </w:p>
+    <w:p>
+      <w:pPr>
+        <w:pStyle w:val="Heading2"/>
+        <w:spacing w:after="120" w:before="240"/>
+      </w:pPr>
+      <w:r>
+        <w:t xml:space="preserve">9.3 Backend Django + API REST</w:t>
+      </w:r>
+    </w:p>
+    <w:p>
+      <w:pPr>
+        <w:pStyle w:val="ListParagraph"/>
+        <w:numPr>
+          <w:ilvl w:val="0"/>
+          <w:numId w:val="2"/>
+        </w:numPr>
+        <w:spacing w:after="80" w:line="280"/>
+      </w:pPr>
+      <w:r>
+        <w:t xml:space="preserve">Modeles V2. MapUpload enrichi (map_name, map_type, confidence_score, qa_passed, retry_count, georef_crs, raster_bounds) et nouveaux modeles Correction et TrainingPatch pour la boucle HITL. Les helpers mark_processing / mark_done / mark_failed simplifient l'orchestration.</w:t>
+      </w:r>
+    </w:p>
+    <w:p>
+      <w:pPr>
+        <w:pStyle w:val="ListParagraph"/>
+        <w:numPr>
+          <w:ilvl w:val="0"/>
+          <w:numId w:val="2"/>
+        </w:numPr>
+        <w:spacing w:after="80" w:line="280"/>
+      </w:pPr>
+      <w:r>
+        <w:t xml:space="preserve">API REST DRF. Endpoints exposes : GET / POST /api/maps/, GET /api/maps/&lt;id&gt;/status/, GET /api/maps/&lt;id&gt;/geojson/, PATCH /api/maps/&lt;id&gt;/corrections/, et endpoints active learning /api/calibration/&lt;series&gt;/.</w:t>
+      </w:r>
+    </w:p>
+    <w:p>
+      <w:pPr>
+        <w:pStyle w:val="Heading2"/>
+        <w:spacing w:after="120" w:before="240"/>
+      </w:pPr>
+      <w:r>
+        <w:t xml:space="preserve">9.4 Frontend React / Vite</w:t>
+      </w:r>
+    </w:p>
+    <w:p>
+      <w:pPr>
+        <w:pStyle w:val="ListParagraph"/>
+        <w:numPr>
+          <w:ilvl w:val="0"/>
+          <w:numId w:val="2"/>
+        </w:numPr>
+        <w:spacing w:after="80" w:line="280"/>
+      </w:pPr>
+      <w:r>
+        <w:t xml:space="preserve">Composant MapViewer.jsx. Visualiseur Leaflet avec ImageOverlay du raster historique + superposition des couches GeoJSON par classe. Edition HITL via Geoman (clic pour selectionner, suppression de faux positifs, edition des sommets), sauvegarde batch via l'API REST.</w:t>
+      </w:r>
+    </w:p>
+    <w:p>
+      <w:pPr>
+        <w:pStyle w:val="ListParagraph"/>
+        <w:numPr>
+          <w:ilvl w:val="0"/>
+          <w:numId w:val="2"/>
+        </w:numPr>
+        <w:spacing w:after="80" w:line="280"/>
+      </w:pPr>
+      <w:r>
+        <w:t xml:space="preserve">Composant CalibrationPanel.jsx. Panneau temps reel de l'etat des calibrations active learning. Compteur de corrections par couche, badge ACTIVE des qu'on atteint 3 corrections, barres colorees pour H / S / V, timeline des modifications et bouton de reset administrateur.</w:t>
+      </w:r>
+    </w:p>
+    <w:p>
+      <w:pPr>
+        <w:pStyle w:val="Heading1"/>
+      </w:pPr>
+      <w:r>
+        <w:t xml:space="preserve">10. Datasets et modeles externes</w:t>
+      </w:r>
+    </w:p>
+    <w:p>
+      <w:pPr>
+        <w:spacing w:after="80"/>
+        <w:jc w:val="center"/>
+      </w:pPr>
+      <w:r>
+        <w:rPr>
+          <w:b/>
+          <w:bCs/>
+          <w:sz w:val="24"/>
+          <w:szCs w:val="24"/>
+        </w:rPr>
+        <w:t xml:space="preserve">Le projet s'appuie sur deux datasets et un modele pre-entraine, tous hors du depot Git pour des raisons de taille.</w:t>
+      </w:r>
+    </w:p>
+    <w:p>
+      <w:pPr>
+        <w:pStyle w:val="Heading2"/>
+        <w:spacing w:after="120" w:before="240"/>
+      </w:pPr>
+      <w:r>
+        <w:t xml:space="preserve">10.1 Dataset SODUCO Benchmark</w:t>
+      </w:r>
+    </w:p>
+    <w:p>
+      <w:pPr>
+        <w:pStyle w:val="ListParagraph"/>
+        <w:numPr>
+          <w:ilvl w:val="0"/>
+          <w:numId w:val="2"/>
+        </w:numPr>
+        <w:spacing w:after="80" w:line="280"/>
+      </w:pPr>
+      <w:r>
+        <w:t xml:space="preserve">Localisation : data/historical_maps/. Cartes du Paris BnF avec labels en couleurs BGR (palette dans classes.json). 5 classes : background, inside_blocks, building_walls, street_network, unknown. 256 images train + 49 images eval, resolution 1 000 x 1 000. Utilise par scripts/train_mapseg.py.</w:t>
+      </w:r>
+    </w:p>
+    <w:p>
+      <w:pPr>
+        <w:pStyle w:val="Heading2"/>
+        <w:spacing w:after="120" w:before="240"/>
+      </w:pPr>
+      <w:r>
+        <w:t xml:space="preserve">10.2 Dataset SEMAP (Petitpierre 2025)</w:t>
+      </w:r>
+    </w:p>
+    <w:p>
+      <w:pPr>
+        <w:pStyle w:val="ListParagraph"/>
+        <w:numPr>
+          <w:ilvl w:val="0"/>
+          <w:numId w:val="2"/>
+        </w:numPr>
+        <w:spacing w:after="80" w:line="280"/>
+      </w:pPr>
+      <w:r>
+        <w:t xml:space="preserve">Le plus gros dataset annote pour la segmentation de cartes historiques a ce jour : 1 439 images reelles + 12 122 synthetiques, soit 13 561 echantillons. Splits officiels train / val / test : 10 703 / 2 712 / 143. Resolution 768 x 768 a 1 000 x 1 000. 6 classes index-based : background, contours, built, non_built, water, road_network. Licence CC BY 4.0.</w:t>
+      </w:r>
+    </w:p>
+    <w:p>
+      <w:pPr>
+        <w:pStyle w:val="ListParagraph"/>
+        <w:numPr>
+          <w:ilvl w:val="0"/>
+          <w:numId w:val="2"/>
+        </w:numPr>
+        <w:spacing w:after="80" w:line="280"/>
+      </w:pPr>
+      <w:r>
+        <w:t xml:space="preserve">Citation : Petitpierre R, Gomez Donoso D, Kriesel B (2025). Semantic Segmentation Map Dataset (Semap). EPFL. DOI 10.5281/zenodo.16164781.</w:t>
+      </w:r>
+    </w:p>
+    <w:p>
+      <w:pPr>
+        <w:pStyle w:val="ListParagraph"/>
+        <w:numPr>
+          <w:ilvl w:val="0"/>
+          <w:numId w:val="2"/>
+        </w:numPr>
+        <w:spacing w:after="80" w:line="280"/>
+      </w:pPr>
+      <w:r>
+        <w:t xml:space="preserve">Le dataset reste localise hors Git (2 Go). Son chemin est defini dans data/semap_config.json, champ external_root. Le chargeur PyTorch pipeline.semap_dataset.SemapDataset utilise les partitions officielles et supporte un flag include_synthetic pour exclure les 12 122 images synthetiques si besoin.</w:t>
+      </w:r>
+    </w:p>
+    <w:p>
+      <w:pPr>
+        <w:pStyle w:val="Heading2"/>
+        <w:spacing w:after="120" w:before="240"/>
+      </w:pPr>
+      <w:r>
+        <w:t xml:space="preserve">10.3 Modele Mask2Former Swin-L pre-entraine</w:t>
+      </w:r>
+    </w:p>
+    <w:p>
+      <w:pPr>
+        <w:pStyle w:val="ListParagraph"/>
+        <w:numPr>
+          <w:ilvl w:val="0"/>
+          <w:numId w:val="2"/>
+        </w:numPr>
+        <w:spacing w:after="80" w:line="280"/>
+      </w:pPr>
+      <w:r>
+        <w:t xml:space="preserve">Fourni avec SEMAP : best_mIoU_iter_138828.pth (908 Mo). Architecture Mask2Former Swin-L, framework mmsegmentation v1.2.2. mIoU rapporte ~0.78 sur SEMAP val. Necessite ~6 Go VRAM en inference, donc incompatible avec une RTX 2050 (4 Go) en pratique. Utilisable directement sur Colab T4 (15 Go VRAM).</w:t>
+      </w:r>
+    </w:p>
+    <w:p>
+      <w:pPr>
+        <w:pStyle w:val="ListParagraph"/>
+        <w:numPr>
+          <w:ilvl w:val="0"/>
+          <w:numId w:val="2"/>
+        </w:numPr>
+        <w:spacing w:after="80" w:line="280"/>
+      </w:pPr>
+      <w:r>
+        <w:t xml:space="preserve">Strategie de distillation documentee dans docs/semap_dataset.md : utiliser Mask2Former sur Colab pour produire des pseudo-GT sur les cartes locales (Tunisie / Algerie), puis ajouter ces masques au training set du U-Net leger (scripts/train_semap.py). Le student U-Net atteint typiquement 90-95% du mIoU du teacher Mask2Former.</w:t>
+      </w:r>
+    </w:p>
+    <w:p>
+      <w:pPr>
+        <w:pStyle w:val="Heading1"/>
+        <w:spacing w:after="120" w:before="240"/>
+      </w:pPr>
+      <w:r>
+        <w:t xml:space="preserve">11. Conclusion</w:t>
       </w:r>
     </w:p>
     <w:p>

</xml_diff>